<commit_message>
Deploy preview for PR 128 🛫
</commit_message>
<xml_diff>
--- a/pr-preview/pr-128/chapters/09-measurement-bias-tracked-changes.docx
+++ b/pr-preview/pr-128/chapters/09-measurement-bias-tracked-changes.docx
@@ -15922,19 +15922,51 @@
               <w:t xml:space="preserve"> </w:t>
             </w:r>
             <w:r>
-              <w:t xml:space="preserve">Consider a DAG that meets the Chapter 6 requirements for a causal diagram,</w:t>
-            </w:r>
-            <w:r>
-              <w:t xml:space="preserve"> </w:t>
-            </w:r>
-            <w:r>
-              <w:t xml:space="preserve">which we restate here: every common cause of two variables on the graph is on the graph,</w:t>
-            </w:r>
-            <w:r>
-              <w:t xml:space="preserve"> </w:t>
-            </w:r>
-            <w:r>
-              <w:t xml:space="preserve">and the</w:t>
+              <w:t xml:space="preserve">Consider a DAG that meets the three conditions for a causal DAG in Chapter 6 (Technical Point 6.1), restated here:</w:t>
+            </w:r>
+          </w:p>
+          <w:p>
+            <w:pPr>
+              <w:pStyle w:val="Compact"/>
+              <w:numPr>
+                <w:ilvl w:val="0"/>
+                <w:numId w:val="1010"/>
+              </w:numPr>
+            </w:pPr>
+            <w:r>
+              <w:t xml:space="preserve">a missing arrow from one variable to another means no direct causal effect relative to the other variables on the graph;</w:t>
+            </w:r>
+          </w:p>
+          <w:p>
+            <w:pPr>
+              <w:pStyle w:val="Compact"/>
+              <w:numPr>
+                <w:ilvl w:val="0"/>
+                <w:numId w:val="1010"/>
+              </w:numPr>
+            </w:pPr>
+            <w:r>
+              <w:t xml:space="preserve">every common cause, measured or not, of any pair of variables on the graph is on the graph;</w:t>
+            </w:r>
+          </w:p>
+          <w:p>
+            <w:pPr>
+              <w:pStyle w:val="Compact"/>
+              <w:numPr>
+                <w:ilvl w:val="0"/>
+                <w:numId w:val="1010"/>
+              </w:numPr>
+            </w:pPr>
+            <w:r>
+              <w:t xml:space="preserve">every variable is a cause of its descendants.</w:t>
+            </w:r>
+          </w:p>
+          <w:p>
+            <w:pPr>
+              <w:pStyle w:val="FirstParagraph"/>
+            </w:pPr>
+            <w:r>
+              <w:t xml:space="preserve">Suppose also that the</w:t>
             </w:r>
             <w:r>
               <w:t xml:space="preserve"> </w:t>
@@ -15951,7 +15983,7 @@
               <w:t xml:space="preserve"> </w:t>
             </w:r>
             <w:r>
-              <w:t xml:space="preserve">holds.</w:t>
+              <w:t xml:space="preserve">links the DAG to the data.</w:t>
             </w:r>
             <w:r>
               <w:t xml:space="preserve"> </w:t>
@@ -16230,7 +16262,7 @@
               <w:pStyle w:val="Compact"/>
               <w:numPr>
                 <w:ilvl w:val="0"/>
-                <w:numId w:val="1010"/>
+                <w:numId w:val="1011"/>
               </w:numPr>
             </w:pPr>
             <m:oMath>
@@ -16279,7 +16311,7 @@
               <w:pStyle w:val="Compact"/>
               <w:numPr>
                 <w:ilvl w:val="0"/>
-                <w:numId w:val="1010"/>
+                <w:numId w:val="1011"/>
               </w:numPr>
             </w:pPr>
             <m:oMath>
@@ -16326,7 +16358,7 @@
               <w:t xml:space="preserve"> </w:t>
             </w:r>
             <w:r>
-              <w:t xml:space="preserve">so, for those experts, the arrow carries no causal meaning.</w:t>
+              <w:t xml:space="preserve">the arrow carries no causal meaning for those experts.</w:t>
             </w:r>
           </w:p>
           <w:p>
@@ -17419,7 +17451,7 @@
               <w:pStyle w:val="Compact"/>
               <w:numPr>
                 <w:ilvl w:val="0"/>
-                <w:numId w:val="1011"/>
+                <w:numId w:val="1012"/>
               </w:numPr>
             </w:pPr>
             <w:r>
@@ -17445,7 +17477,7 @@
               <w:pStyle w:val="Compact"/>
               <w:numPr>
                 <w:ilvl w:val="0"/>
-                <w:numId w:val="1011"/>
+                <w:numId w:val="1012"/>
               </w:numPr>
             </w:pPr>
             <w:r>
@@ -23857,7 +23889,7 @@
         <w:pStyle w:val="Compact"/>
         <w:numPr>
           <w:ilvl w:val="0"/>
-          <w:numId w:val="1012"/>
+          <w:numId w:val="1013"/>
         </w:numPr>
       </w:pPr>
       <w:ins w:id="105" w:author="PR Preview" w:date="2024-01-01T00:00:00Z">
@@ -23994,7 +24026,7 @@
         <w:pStyle w:val="Compact"/>
         <w:numPr>
           <w:ilvl w:val="0"/>
-          <w:numId w:val="1012"/>
+          <w:numId w:val="1013"/>
         </w:numPr>
       </w:pPr>
       <w:r>
@@ -24050,7 +24082,7 @@
         <w:pStyle w:val="Compact"/>
         <w:numPr>
           <w:ilvl w:val="0"/>
-          <w:numId w:val="1012"/>
+          <w:numId w:val="1013"/>
         </w:numPr>
       </w:pPr>
       <w:r>
@@ -24090,7 +24122,7 @@
         <w:pStyle w:val="Compact"/>
         <w:numPr>
           <w:ilvl w:val="0"/>
-          <w:numId w:val="1012"/>
+          <w:numId w:val="1013"/>
         </w:numPr>
       </w:pPr>
       <w:ins w:id="108" w:author="PR Preview" w:date="2024-01-01T00:00:00Z">
@@ -24157,7 +24189,7 @@
         <w:pStyle w:val="Compact"/>
         <w:numPr>
           <w:ilvl w:val="0"/>
-          <w:numId w:val="1012"/>
+          <w:numId w:val="1013"/>
         </w:numPr>
       </w:pPr>
       <w:r>
@@ -24169,7 +24201,7 @@
         <w:pStyle w:val="Compact"/>
         <w:numPr>
           <w:ilvl w:val="0"/>
-          <w:numId w:val="1012"/>
+          <w:numId w:val="1013"/>
         </w:numPr>
       </w:pPr>
       <w:r>
@@ -24607,12 +24639,42 @@
     <w:abstractNumId w:val="991"/>
   </w:num>
   <w:num w:numId="1010">
-    <w:abstractNumId w:val="991"/>
+    <w:abstractNumId w:val="99411"/>
+    <w:lvlOverride w:ilvl="0">
+      <w:startOverride w:val="1"/>
+    </w:lvlOverride>
+    <w:lvlOverride w:ilvl="1">
+      <w:startOverride w:val="1"/>
+    </w:lvlOverride>
+    <w:lvlOverride w:ilvl="2">
+      <w:startOverride w:val="1"/>
+    </w:lvlOverride>
+    <w:lvlOverride w:ilvl="3">
+      <w:startOverride w:val="1"/>
+    </w:lvlOverride>
+    <w:lvlOverride w:ilvl="4">
+      <w:startOverride w:val="1"/>
+    </w:lvlOverride>
+    <w:lvlOverride w:ilvl="5">
+      <w:startOverride w:val="1"/>
+    </w:lvlOverride>
+    <w:lvlOverride w:ilvl="6">
+      <w:startOverride w:val="1"/>
+    </w:lvlOverride>
+    <w:lvlOverride w:ilvl="7">
+      <w:startOverride w:val="1"/>
+    </w:lvlOverride>
+    <w:lvlOverride w:ilvl="8">
+      <w:startOverride w:val="1"/>
+    </w:lvlOverride>
   </w:num>
   <w:num w:numId="1011">
     <w:abstractNumId w:val="991"/>
   </w:num>
   <w:num w:numId="1012">
+    <w:abstractNumId w:val="991"/>
+  </w:num>
+  <w:num w:numId="1013">
     <w:abstractNumId w:val="99411"/>
     <w:lvlOverride w:ilvl="0">
       <w:startOverride w:val="1"/>

</xml_diff>